<commit_message>
Rebuild the operator guide at the merged revision
The guide was generated before the release-notes harvest landed, so it named
f6e96a1 while master carried the 16 new backlog items and 19 new requirements
that harvest added. Regenerating picks those up and re-stamps the document.

Content is unchanged in shape - 490 paragraphs, 38 tables, 12 sections - and
docs-check reads the revision back out of the document's own core properties,
so committing this does not invalidate it.

Co-Authored-By: Claude Opus 5 (1M context) <noreply@anthropic.com>
</commit_message>
<xml_diff>
--- a/osm-sample-manager/docs/OSM-Sample-Manager-Guide.docx
+++ b/osm-sample-manager/docs/OSM-Sample-Manager-Guide.docx
@@ -233,7 +233,7 @@
               <w:rPr>
                 <w:rStyle w:val="OSMMono"/>
               </w:rPr>
-              <w:t>dfca4e1</w:t>
+              <w:t>7967346</w:t>
             </w:r>
             <w:r>
               <w:rPr>
@@ -245,7 +245,7 @@
               <w:rPr>
                 <w:rStyle w:val="OSMMono"/>
               </w:rPr>
-              <w:t>pr-001b-labkey-doc-harvest</w:t>
+              <w:t>master</w:t>
             </w:r>
           </w:p>
         </w:tc>
@@ -24761,7 +24761,7 @@
               <w:rPr>
                 <w:rStyle w:val="OSMMono"/>
               </w:rPr>
-              <w:t>dfca4e1671fa665ab57af39a61c808e250dc3abf</w:t>
+              <w:t>7967346d50a2b7fd2fbc57adfae751fe9da614c1</w:t>
             </w:r>
           </w:p>
         </w:tc>
@@ -24805,7 +24805,7 @@
               <w:rPr>
                 <w:rStyle w:val="OSMMono"/>
               </w:rPr>
-              <w:t>pr-001b-labkey-doc-harvest</w:t>
+              <w:t>master</w:t>
             </w:r>
           </w:p>
         </w:tc>
@@ -38851,7 +38851,7 @@
         <w:rPr>
           <w:rStyle w:val="OSMMono"/>
         </w:rPr>
-        <w:t>dfca4e1671fa665ab57af39a61c808e250dc3abf</w:t>
+        <w:t>7967346d50a2b7fd2fbc57adfae751fe9da614c1</w:t>
       </w:r>
       <w:r>
         <w:t xml:space="preserve"> on branch </w:t>
@@ -38860,7 +38860,7 @@
         <w:rPr>
           <w:rStyle w:val="OSMMono"/>
         </w:rPr>
-        <w:t>pr-001b-labkey-doc-harvest</w:t>
+        <w:t>master</w:t>
       </w:r>
       <w:r>
         <w:t xml:space="preserve">, dated 2026-08-26. The project version, revision, backlog, decision register, capability rollups and knowledge-base row counts are read from </w:t>
@@ -38939,7 +38939,7 @@
         <w:color w:val="606060"/>
         <w:sz w:val="16"/>
       </w:rPr>
-      <w:t>OSM Sample Manager Guide · version 0.1.0 · rev dfca4e1</w:t>
+      <w:t>OSM Sample Manager Guide · version 0.1.0 · rev 7967346</w:t>
       <w:tab/>
     </w:r>
     <w:r>

</xml_diff>